<commit_message>
Complete Milestone 1 live verification
</commit_message>
<xml_diff>
--- a/milestones/milestone-1-flow/evidence/Milestone_1_Flow_Screenshot_Evidence.docx
+++ b/milestones/milestone-1-flow/evidence/Milestone_1_Flow_Screenshot_Evidence.docx
@@ -11,7 +11,7 @@
           <w:b/>
           <w:sz w:val="40"/>
         </w:rPr>
-        <w:t>Milestone 1 — Flow Designer Screenshot Evidence</w:t>
+        <w:t>Milestone 1 — Required ServiceNow Screenshot Evidence</w:t>
       </w:r>
     </w:p>
     <w:p>
@@ -20,8 +20,7 @@
       </w:pPr>
       <w:r>
         <w:rPr>
-          <w:i/>
-          <w:sz w:val="22"/>
+          <w:sz w:val="24"/>
         </w:rPr>
         <w:t>Streamlining IT Procurement: Automating Standard Laptop Orders with Flow Designer</w:t>
       </w:r>
@@ -32,41 +31,286 @@
       </w:pPr>
       <w:r>
         <w:rPr>
+          <w:i/>
+          <w:sz w:val="20"/>
+        </w:rPr>
+        <w:t>Only the relevant Milestone 1 evidence screenshots are included in this document.</w:t>
+      </w:r>
+    </w:p>
+    <w:p/>
+    <w:tbl>
+      <w:tblPr>
+        <w:tblStyle w:val="TableGrid"/>
+        <w:tblW w:type="auto" w:w="0"/>
+        <w:tblLook w:firstColumn="1" w:firstRow="1" w:lastColumn="0" w:lastRow="0" w:noHBand="0" w:noVBand="1" w:val="04A0"/>
+      </w:tblPr>
+      <w:tblGrid>
+        <w:gridCol w:w="4752"/>
+        <w:gridCol w:w="4752"/>
+        <w:gridCol w:w="4752"/>
+      </w:tblGrid>
+      <w:tr>
+        <w:tc>
+          <w:tcPr>
+            <w:tcW w:type="dxa" w:w="4752"/>
+          </w:tcPr>
+          <w:p>
+            <w:r>
+              <w:t>Evidence</w:t>
+            </w:r>
+          </w:p>
+        </w:tc>
+        <w:tc>
+          <w:tcPr>
+            <w:tcW w:type="dxa" w:w="4752"/>
+          </w:tcPr>
+          <w:p>
+            <w:r>
+              <w:t>Artifact</w:t>
+            </w:r>
+          </w:p>
+        </w:tc>
+        <w:tc>
+          <w:tcPr>
+            <w:tcW w:type="dxa" w:w="4752"/>
+          </w:tcPr>
+          <w:p>
+            <w:r>
+              <w:t>What it proves</w:t>
+            </w:r>
+          </w:p>
+        </w:tc>
+      </w:tr>
+      <w:tr>
+        <w:tc>
+          <w:tcPr>
+            <w:tcW w:type="dxa" w:w="4752"/>
+          </w:tcPr>
+          <w:p>
+            <w:r>
+              <w:t>1</w:t>
+            </w:r>
+          </w:p>
+        </w:tc>
+        <w:tc>
+          <w:tcPr>
+            <w:tcW w:type="dxa" w:w="4752"/>
+          </w:tcPr>
+          <w:p>
+            <w:r>
+              <w:t>Flow Designer Overview</w:t>
+            </w:r>
+          </w:p>
+        </w:tc>
+        <w:tc>
+          <w:tcPr>
+            <w:tcW w:type="dxa" w:w="4752"/>
+          </w:tcPr>
+          <w:p>
+            <w:r>
+              <w:t>Shows the actual ServiceNow Flow Designer / Workflow Studio flow named “Standard Laptop Task”, with the Service Catalog trigger, Create Catalog Task action, and Active badge.</w:t>
+            </w:r>
+          </w:p>
+        </w:tc>
+      </w:tr>
+      <w:tr>
+        <w:tc>
+          <w:tcPr>
+            <w:tcW w:type="dxa" w:w="4752"/>
+          </w:tcPr>
+          <w:p>
+            <w:r>
+              <w:t>2</w:t>
+            </w:r>
+          </w:p>
+        </w:tc>
+        <w:tc>
+          <w:tcPr>
+            <w:tcW w:type="dxa" w:w="4752"/>
+          </w:tcPr>
+          <w:p>
+            <w:r>
+              <w:t>Create Catalog Task Field Mappings</w:t>
+            </w:r>
+          </w:p>
+        </w:tc>
+        <w:tc>
+          <w:tcPr>
+            <w:tcW w:type="dxa" w:w="4752"/>
+          </w:tcPr>
+          <w:p>
+            <w:r>
+              <w:t>Shows Catalog Task [sc_task], dynamic Trigger → Requested Item mapping, Short Description, Description, Assignment group = Hardware, and Approval = Approved.</w:t>
+            </w:r>
+          </w:p>
+        </w:tc>
+      </w:tr>
+      <w:tr>
+        <w:tc>
+          <w:tcPr>
+            <w:tcW w:type="dxa" w:w="4752"/>
+          </w:tcPr>
+          <w:p>
+            <w:r>
+              <w:t>3</w:t>
+            </w:r>
+          </w:p>
+        </w:tc>
+        <w:tc>
+          <w:tcPr>
+            <w:tcW w:type="dxa" w:w="4752"/>
+          </w:tcPr>
+          <w:p>
+            <w:r>
+              <w:t>Standard Laptop Catalog Item Association</w:t>
+            </w:r>
+          </w:p>
+        </w:tc>
+        <w:tc>
+          <w:tcPr>
+            <w:tcW w:type="dxa" w:w="4752"/>
+          </w:tcPr>
+          <w:p>
+            <w:r>
+              <w:t>Shows Standard Laptop → Process Engine with Flow = Standard Laptop task, with Workflow and Execution Plan left blank.</w:t>
+            </w:r>
+          </w:p>
+        </w:tc>
+      </w:tr>
+      <w:tr>
+        <w:tc>
+          <w:tcPr>
+            <w:tcW w:type="dxa" w:w="4752"/>
+          </w:tcPr>
+          <w:p>
+            <w:r>
+              <w:t>4</w:t>
+            </w:r>
+          </w:p>
+        </w:tc>
+        <w:tc>
+          <w:tcPr>
+            <w:tcW w:type="dxa" w:w="4752"/>
+          </w:tcPr>
+          <w:p>
+            <w:r>
+              <w:t>Approved Test Request</w:t>
+            </w:r>
+          </w:p>
+        </w:tc>
+        <w:tc>
+          <w:tcPr>
+            <w:tcW w:type="dxa" w:w="4752"/>
+          </w:tcPr>
+          <w:p>
+            <w:r>
+              <w:t>Shows the real test Request REQ0010001 with Approval = Approved and Request state = Approved.</w:t>
+            </w:r>
+          </w:p>
+        </w:tc>
+      </w:tr>
+      <w:tr>
+        <w:tc>
+          <w:tcPr>
+            <w:tcW w:type="dxa" w:w="4752"/>
+          </w:tcPr>
+          <w:p>
+            <w:r>
+              <w:t>5</w:t>
+            </w:r>
+          </w:p>
+        </w:tc>
+        <w:tc>
+          <w:tcPr>
+            <w:tcW w:type="dxa" w:w="4752"/>
+          </w:tcPr>
+          <w:p>
+            <w:r>
+              <w:t>RITM and Automatically Created Catalog Task</w:t>
+            </w:r>
+          </w:p>
+        </w:tc>
+        <w:tc>
+          <w:tcPr>
+            <w:tcW w:type="dxa" w:w="4752"/>
+          </w:tcPr>
+          <w:p>
+            <w:r>
+              <w:t>Shows RITM0010001 with Item = Standard Laptop and Catalog Tasks (1), including SCTASK0010002, Assignment group = Hardware, and Short description = Laptop need to Configured.</w:t>
+            </w:r>
+          </w:p>
+        </w:tc>
+      </w:tr>
+      <w:tr>
+        <w:tc>
+          <w:tcPr>
+            <w:tcW w:type="dxa" w:w="4752"/>
+          </w:tcPr>
+          <w:p>
+            <w:r>
+              <w:t>6</w:t>
+            </w:r>
+          </w:p>
+        </w:tc>
+        <w:tc>
+          <w:tcPr>
+            <w:tcW w:type="dxa" w:w="4752"/>
+          </w:tcPr>
+          <w:p>
+            <w:r>
+              <w:t>Generated Catalog Task Record</w:t>
+            </w:r>
+          </w:p>
+        </w:tc>
+        <w:tc>
+          <w:tcPr>
+            <w:tcW w:type="dxa" w:w="4752"/>
+          </w:tcPr>
+          <w:p>
+            <w:r>
+              <w:t>Shows real Catalog Task SCTASK0010002 linked to RITM0010001, Approval = Approved, State = Open, and the configured short description and description.</w:t>
+            </w:r>
+          </w:p>
+        </w:tc>
+      </w:tr>
+    </w:tbl>
+    <w:p>
+      <w:r>
+        <w:rPr>
           <w:b/>
         </w:rPr>
-        <w:t>Milestone 1: Flow</w:t>
+        <w:t xml:space="preserve">Live test result represented in evidence: </w:t>
+      </w:r>
+      <w:r>
+        <w:t>REQ0010001 → RITM0010001 → SCTASK0010002; the Catalog Task appears under the RITM and is assigned to Hardware.</w:t>
+      </w:r>
+    </w:p>
+    <w:p>
+      <w:r>
+        <w:br w:type="page"/>
       </w:r>
     </w:p>
     <w:p>
       <w:pPr>
-        <w:spacing w:after="60"/>
+        <w:jc w:val="center"/>
       </w:pPr>
       <w:r>
         <w:rPr>
           <w:b/>
+          <w:sz w:val="30"/>
         </w:rPr>
-        <w:t xml:space="preserve">Evidence source: </w:t>
-      </w:r>
-      <w:r>
-        <w:t>Screenshots captured from the live ServiceNow instance</w:t>
+        <w:t>Evidence 1 — Flow Designer Overview</w:t>
       </w:r>
     </w:p>
     <w:p>
       <w:pPr>
-        <w:pStyle w:val="Heading1"/>
+        <w:jc w:val="center"/>
       </w:pPr>
       <w:r>
-        <w:t>1. Evidence 1 — Flow Designer Overview</w:t>
-      </w:r>
-    </w:p>
-    <w:p>
-      <w:r>
-        <w:t>The screenshot shows the ServiceNow Workflow Studio / Flow Designer page for the flow Standard Laptop Task.</w:t>
-      </w:r>
-    </w:p>
-    <w:p>
-      <w:r>
-        <w:t>Visible configuration: Flow name = Standard Laptop Task; Application = Global; Trigger = Service Catalog; Action = Create Catalog Task; Active badge is visible.</w:t>
+        <w:rPr>
+          <w:sz w:val="19"/>
+        </w:rPr>
+        <w:t>Shows the actual ServiceNow Flow Designer / Workflow Studio flow named “Standard Laptop Task”, with the Service Catalog trigger, Create Catalog Task action, and Active badge.</w:t>
       </w:r>
     </w:p>
     <w:p>
@@ -76,7 +320,7 @@
       <w:r>
         <w:drawing>
           <wp:inline xmlns:a="http://schemas.openxmlformats.org/drawingml/2006/main" xmlns:pic="http://schemas.openxmlformats.org/drawingml/2006/picture">
-            <wp:extent cx="6035040" cy="3771506"/>
+            <wp:extent cx="8961120" cy="5600116"/>
             <wp:docPr id="1" name="Picture 1"/>
             <wp:cNvGraphicFramePr>
               <a:graphicFrameLocks noChangeAspect="1"/>
@@ -85,7 +329,7 @@
               <a:graphicData uri="http://schemas.openxmlformats.org/drawingml/2006/picture">
                 <pic:pic>
                   <pic:nvPicPr>
-                    <pic:cNvPr id="0" name="Screenshot 2026-09-28 150236.png"/>
+                    <pic:cNvPr id="0" name="image(20260928-092823).png"/>
                     <pic:cNvPicPr/>
                   </pic:nvPicPr>
                   <pic:blipFill>
@@ -97,7 +341,7 @@
                   <pic:spPr>
                     <a:xfrm>
                       <a:off x="0" y="0"/>
-                      <a:ext cx="6035040" cy="3771506"/>
+                      <a:ext cx="8961120" cy="5600116"/>
                     </a:xfrm>
                     <a:prstGeom prst="rect"/>
                   </pic:spPr>
@@ -109,75 +353,31 @@
       </w:r>
     </w:p>
     <w:p>
+      <w:r>
+        <w:br w:type="page"/>
+      </w:r>
+    </w:p>
+    <w:p>
       <w:pPr>
         <w:jc w:val="center"/>
       </w:pPr>
       <w:r>
-        <w:t>Figure 1. Flow Designer overview showing Standard Laptop Task, Service Catalog trigger, Create Catalog Task action, and Active badge.</w:t>
+        <w:rPr>
+          <w:b/>
+          <w:sz w:val="30"/>
+        </w:rPr>
+        <w:t>Evidence 2 — Create Catalog Task Field Mappings</w:t>
       </w:r>
     </w:p>
     <w:p>
       <w:pPr>
-        <w:pStyle w:val="Heading1"/>
+        <w:jc w:val="center"/>
       </w:pPr>
       <w:r>
-        <w:t>2. Evidence 2 — Create Catalog Task Action Configuration</w:t>
-      </w:r>
-    </w:p>
-    <w:p>
-      <w:pPr>
-        <w:pStyle w:val="ListBullet"/>
-      </w:pPr>
-      <w:r>
-        <w:t>The expanded Create Catalog Task action shows the fields configured for Milestone 1.</w:t>
-      </w:r>
-    </w:p>
-    <w:p>
-      <w:pPr>
-        <w:pStyle w:val="ListBullet"/>
-      </w:pPr>
-      <w:r>
-        <w:t>Table = Catalog Task [sc_task].</w:t>
-      </w:r>
-    </w:p>
-    <w:p>
-      <w:pPr>
-        <w:pStyle w:val="ListBullet"/>
-      </w:pPr>
-      <w:r>
-        <w:t>Requested Item = dynamic Trigger → Requested Item data pill.</w:t>
-      </w:r>
-    </w:p>
-    <w:p>
-      <w:pPr>
-        <w:pStyle w:val="ListBullet"/>
-      </w:pPr>
-      <w:r>
-        <w:t>Short Description = Laptop need to Configured.</w:t>
-      </w:r>
-    </w:p>
-    <w:p>
-      <w:pPr>
-        <w:pStyle w:val="ListBullet"/>
-      </w:pPr>
-      <w:r>
-        <w:t>Description = Laptop need to Configured.</w:t>
-      </w:r>
-    </w:p>
-    <w:p>
-      <w:pPr>
-        <w:pStyle w:val="ListBullet"/>
-      </w:pPr>
-      <w:r>
-        <w:t>Assignment group = Hardware.</w:t>
-      </w:r>
-    </w:p>
-    <w:p>
-      <w:pPr>
-        <w:pStyle w:val="ListBullet"/>
-      </w:pPr>
-      <w:r>
-        <w:t>Approval = Approved.</w:t>
+        <w:rPr>
+          <w:sz w:val="19"/>
+        </w:rPr>
+        <w:t>Shows Catalog Task [sc_task], dynamic Trigger → Requested Item mapping, Short Description, Description, Assignment group = Hardware, and Approval = Approved.</w:t>
       </w:r>
     </w:p>
     <w:p>
@@ -187,7 +387,7 @@
       <w:r>
         <w:drawing>
           <wp:inline xmlns:a="http://schemas.openxmlformats.org/drawingml/2006/main" xmlns:pic="http://schemas.openxmlformats.org/drawingml/2006/picture">
-            <wp:extent cx="6035040" cy="3771506"/>
+            <wp:extent cx="8961120" cy="5600116"/>
             <wp:docPr id="2" name="Picture 2"/>
             <wp:cNvGraphicFramePr>
               <a:graphicFrameLocks noChangeAspect="1"/>
@@ -196,7 +396,7 @@
               <a:graphicData uri="http://schemas.openxmlformats.org/drawingml/2006/picture">
                 <pic:pic>
                   <pic:nvPicPr>
-                    <pic:cNvPr id="0" name="Screenshot 2026-09-28 150146(1).png"/>
+                    <pic:cNvPr id="0" name="image(20260928-093152).png"/>
                     <pic:cNvPicPr/>
                   </pic:nvPicPr>
                   <pic:blipFill>
@@ -208,7 +408,7 @@
                   <pic:spPr>
                     <a:xfrm>
                       <a:off x="0" y="0"/>
-                      <a:ext cx="6035040" cy="3771506"/>
+                      <a:ext cx="8961120" cy="5600116"/>
                     </a:xfrm>
                     <a:prstGeom prst="rect"/>
                   </pic:spPr>
@@ -220,29 +420,31 @@
       </w:r>
     </w:p>
     <w:p>
+      <w:r>
+        <w:br w:type="page"/>
+      </w:r>
+    </w:p>
+    <w:p>
       <w:pPr>
         <w:jc w:val="center"/>
       </w:pPr>
       <w:r>
-        <w:t>Figure 2. Expanded Create Catalog Task action showing Requested Item mapping and required field values.</w:t>
+        <w:rPr>
+          <w:b/>
+          <w:sz w:val="30"/>
+        </w:rPr>
+        <w:t>Evidence 3 — Standard Laptop Catalog Item Association</w:t>
       </w:r>
     </w:p>
     <w:p>
       <w:pPr>
-        <w:pStyle w:val="Heading1"/>
+        <w:jc w:val="center"/>
       </w:pPr>
       <w:r>
-        <w:t>3. Evidence 3 — Standard Laptop Catalog Item Association</w:t>
-      </w:r>
-    </w:p>
-    <w:p>
-      <w:r>
-        <w:t>The Standard Laptop Catalog Item was configured under the Process Engine section with the Flow field set to Standard Laptop task.</w:t>
-      </w:r>
-    </w:p>
-    <w:p>
-      <w:r>
-        <w:t>The Catalog Item was then updated.</w:t>
+        <w:rPr>
+          <w:sz w:val="19"/>
+        </w:rPr>
+        <w:t>Shows Standard Laptop → Process Engine with Flow = Standard Laptop task, with Workflow and Execution Plan left blank.</w:t>
       </w:r>
     </w:p>
     <w:p>
@@ -252,7 +454,7 @@
       <w:r>
         <w:drawing>
           <wp:inline xmlns:a="http://schemas.openxmlformats.org/drawingml/2006/main" xmlns:pic="http://schemas.openxmlformats.org/drawingml/2006/picture">
-            <wp:extent cx="6035040" cy="3771506"/>
+            <wp:extent cx="8961120" cy="5600116"/>
             <wp:docPr id="3" name="Picture 3"/>
             <wp:cNvGraphicFramePr>
               <a:graphicFrameLocks noChangeAspect="1"/>
@@ -273,7 +475,7 @@
                   <pic:spPr>
                     <a:xfrm>
                       <a:off x="0" y="0"/>
-                      <a:ext cx="6035040" cy="3771506"/>
+                      <a:ext cx="8961120" cy="5600116"/>
                     </a:xfrm>
                     <a:prstGeom prst="rect"/>
                   </pic:spPr>
@@ -285,377 +487,210 @@
       </w:r>
     </w:p>
     <w:p>
+      <w:r>
+        <w:br w:type="page"/>
+      </w:r>
+    </w:p>
+    <w:p>
       <w:pPr>
         <w:jc w:val="center"/>
       </w:pPr>
       <w:r>
-        <w:t>Figure 3. Standard Laptop Catalog Item → Process Engine showing Flow = Standard Laptop task.</w:t>
+        <w:rPr>
+          <w:b/>
+          <w:sz w:val="30"/>
+        </w:rPr>
+        <w:t>Evidence 4 — Approved Test Request</w:t>
       </w:r>
     </w:p>
     <w:p>
       <w:pPr>
-        <w:pStyle w:val="Heading1"/>
+        <w:jc w:val="center"/>
       </w:pPr>
       <w:r>
-        <w:t>4. Current Verification Status</w:t>
+        <w:rPr>
+          <w:sz w:val="19"/>
+        </w:rPr>
+        <w:t>Shows the real test Request REQ0010001 with Approval = Approved and Request state = Approved.</w:t>
+      </w:r>
+    </w:p>
+    <w:p>
+      <w:pPr>
+        <w:jc w:val="center"/>
+      </w:pPr>
+      <w:r>
+        <w:drawing>
+          <wp:inline xmlns:a="http://schemas.openxmlformats.org/drawingml/2006/main" xmlns:pic="http://schemas.openxmlformats.org/drawingml/2006/picture">
+            <wp:extent cx="8961120" cy="5600116"/>
+            <wp:docPr id="4" name="Picture 4"/>
+            <wp:cNvGraphicFramePr>
+              <a:graphicFrameLocks noChangeAspect="1"/>
+            </wp:cNvGraphicFramePr>
+            <a:graphic>
+              <a:graphicData uri="http://schemas.openxmlformats.org/drawingml/2006/picture">
+                <pic:pic>
+                  <pic:nvPicPr>
+                    <pic:cNvPr id="0" name="image(20260929-070756).png"/>
+                    <pic:cNvPicPr/>
+                  </pic:nvPicPr>
+                  <pic:blipFill>
+                    <a:blip r:embed="rId12"/>
+                    <a:stretch>
+                      <a:fillRect/>
+                    </a:stretch>
+                  </pic:blipFill>
+                  <pic:spPr>
+                    <a:xfrm>
+                      <a:off x="0" y="0"/>
+                      <a:ext cx="8961120" cy="5600116"/>
+                    </a:xfrm>
+                    <a:prstGeom prst="rect"/>
+                  </pic:spPr>
+                </pic:pic>
+              </a:graphicData>
+            </a:graphic>
+          </wp:inline>
+        </w:drawing>
       </w:r>
     </w:p>
     <w:p>
       <w:r>
+        <w:br w:type="page"/>
+      </w:r>
+    </w:p>
+    <w:p>
+      <w:pPr>
+        <w:jc w:val="center"/>
+      </w:pPr>
+      <w:r>
         <w:rPr>
           <w:b/>
+          <w:sz w:val="30"/>
         </w:rPr>
-        <w:t xml:space="preserve">Configuration evidence: </w:t>
+        <w:t>Evidence 5 — RITM and Automatically Created Catalog Task</w:t>
       </w:r>
+    </w:p>
+    <w:p>
+      <w:pPr>
+        <w:jc w:val="center"/>
+      </w:pPr>
       <w:r>
-        <w:t>Verified by the screenshots above.</w:t>
+        <w:rPr>
+          <w:sz w:val="19"/>
+        </w:rPr>
+        <w:t>Shows RITM0010001 with Item = Standard Laptop and Catalog Tasks (1), including SCTASK0010002, Assignment group = Hardware, and Short description = Laptop need to Configured.</w:t>
+      </w:r>
+    </w:p>
+    <w:p>
+      <w:pPr>
+        <w:jc w:val="center"/>
+      </w:pPr>
+      <w:r>
+        <w:drawing>
+          <wp:inline xmlns:a="http://schemas.openxmlformats.org/drawingml/2006/main" xmlns:pic="http://schemas.openxmlformats.org/drawingml/2006/picture">
+            <wp:extent cx="8961120" cy="2484781"/>
+            <wp:docPr id="5" name="Picture 5"/>
+            <wp:cNvGraphicFramePr>
+              <a:graphicFrameLocks noChangeAspect="1"/>
+            </wp:cNvGraphicFramePr>
+            <a:graphic>
+              <a:graphicData uri="http://schemas.openxmlformats.org/drawingml/2006/picture">
+                <pic:pic>
+                  <pic:nvPicPr>
+                    <pic:cNvPr id="0" name="image(20260929-070933).png"/>
+                    <pic:cNvPicPr/>
+                  </pic:nvPicPr>
+                  <pic:blipFill>
+                    <a:blip r:embed="rId13"/>
+                    <a:stretch>
+                      <a:fillRect/>
+                    </a:stretch>
+                  </pic:blipFill>
+                  <pic:spPr>
+                    <a:xfrm>
+                      <a:off x="0" y="0"/>
+                      <a:ext cx="8961120" cy="2484781"/>
+                    </a:xfrm>
+                    <a:prstGeom prst="rect"/>
+                  </pic:spPr>
+                </pic:pic>
+              </a:graphicData>
+            </a:graphic>
+          </wp:inline>
+        </w:drawing>
       </w:r>
     </w:p>
     <w:p>
       <w:r>
-        <w:rPr>
-          <w:b/>
-        </w:rPr>
-        <w:t xml:space="preserve">End-to-end runtime verification: </w:t>
-      </w:r>
-      <w:r>
-        <w:t>Not performed in the provided evidence. No test order, completed approval, or actual generated Catalog Task record is shown.</w:t>
+        <w:br w:type="page"/>
       </w:r>
     </w:p>
     <w:p>
       <w:pPr>
-        <w:pStyle w:val="Heading1"/>
+        <w:jc w:val="center"/>
       </w:pPr>
       <w:r>
-        <w:t>5. Milestone 1 Configuration Summary</w:t>
-      </w:r>
-    </w:p>
-    <w:tbl>
-      <w:tblPr>
-        <w:tblStyle w:val="TableGrid"/>
-        <w:tblW w:type="auto" w:w="0"/>
-        <w:tblLook w:firstColumn="1" w:firstRow="1" w:lastColumn="0" w:lastRow="0" w:noHBand="0" w:noVBand="1" w:val="04A0"/>
-      </w:tblPr>
-      <w:tblGrid>
-        <w:gridCol w:w="5040"/>
-        <w:gridCol w:w="5040"/>
-      </w:tblGrid>
-      <w:tr>
-        <w:tc>
-          <w:tcPr>
-            <w:tcW w:type="dxa" w:w="5040"/>
-          </w:tcPr>
-          <w:p>
-            <w:r>
-              <w:t>Configuration item</w:t>
-            </w:r>
-          </w:p>
-        </w:tc>
-        <w:tc>
-          <w:tcPr>
-            <w:tcW w:type="dxa" w:w="5040"/>
-          </w:tcPr>
-          <w:p>
-            <w:r>
-              <w:t>Configured value</w:t>
-            </w:r>
-          </w:p>
-        </w:tc>
-      </w:tr>
-      <w:tr>
-        <w:tc>
-          <w:tcPr>
-            <w:tcW w:type="dxa" w:w="5040"/>
-          </w:tcPr>
-          <w:p>
-            <w:r>
-              <w:t>Flow Name</w:t>
-            </w:r>
-          </w:p>
-        </w:tc>
-        <w:tc>
-          <w:tcPr>
-            <w:tcW w:type="dxa" w:w="5040"/>
-          </w:tcPr>
-          <w:p>
-            <w:r>
-              <w:t>Standard Laptop Task</w:t>
-            </w:r>
-          </w:p>
-        </w:tc>
-      </w:tr>
-      <w:tr>
-        <w:tc>
-          <w:tcPr>
-            <w:tcW w:type="dxa" w:w="5040"/>
-          </w:tcPr>
-          <w:p>
-            <w:r>
-              <w:t>Trigger</w:t>
-            </w:r>
-          </w:p>
-        </w:tc>
-        <w:tc>
-          <w:tcPr>
-            <w:tcW w:type="dxa" w:w="5040"/>
-          </w:tcPr>
-          <w:p>
-            <w:r>
-              <w:t>Service Catalog</w:t>
-            </w:r>
-          </w:p>
-        </w:tc>
-      </w:tr>
-      <w:tr>
-        <w:tc>
-          <w:tcPr>
-            <w:tcW w:type="dxa" w:w="5040"/>
-          </w:tcPr>
-          <w:p>
-            <w:r>
-              <w:t>Action</w:t>
-            </w:r>
-          </w:p>
-        </w:tc>
-        <w:tc>
-          <w:tcPr>
-            <w:tcW w:type="dxa" w:w="5040"/>
-          </w:tcPr>
-          <w:p>
-            <w:r>
-              <w:t>Create Catalog Task</w:t>
-            </w:r>
-          </w:p>
-        </w:tc>
-      </w:tr>
-      <w:tr>
-        <w:tc>
-          <w:tcPr>
-            <w:tcW w:type="dxa" w:w="5040"/>
-          </w:tcPr>
-          <w:p>
-            <w:r>
-              <w:t>Requested Item Mapping</w:t>
-            </w:r>
-          </w:p>
-        </w:tc>
-        <w:tc>
-          <w:tcPr>
-            <w:tcW w:type="dxa" w:w="5040"/>
-          </w:tcPr>
-          <w:p>
-            <w:r>
-              <w:t>Trigger → Requested Item Record</w:t>
-            </w:r>
-          </w:p>
-        </w:tc>
-      </w:tr>
-      <w:tr>
-        <w:tc>
-          <w:tcPr>
-            <w:tcW w:type="dxa" w:w="5040"/>
-          </w:tcPr>
-          <w:p>
-            <w:r>
-              <w:t>Short Description</w:t>
-            </w:r>
-          </w:p>
-        </w:tc>
-        <w:tc>
-          <w:tcPr>
-            <w:tcW w:type="dxa" w:w="5040"/>
-          </w:tcPr>
-          <w:p>
-            <w:r>
-              <w:t>Laptop need to Configured</w:t>
-            </w:r>
-          </w:p>
-        </w:tc>
-      </w:tr>
-      <w:tr>
-        <w:tc>
-          <w:tcPr>
-            <w:tcW w:type="dxa" w:w="5040"/>
-          </w:tcPr>
-          <w:p>
-            <w:r>
-              <w:t>Description</w:t>
-            </w:r>
-          </w:p>
-        </w:tc>
-        <w:tc>
-          <w:tcPr>
-            <w:tcW w:type="dxa" w:w="5040"/>
-          </w:tcPr>
-          <w:p>
-            <w:r>
-              <w:t>Laptop need to Configured</w:t>
-            </w:r>
-          </w:p>
-        </w:tc>
-      </w:tr>
-      <w:tr>
-        <w:tc>
-          <w:tcPr>
-            <w:tcW w:type="dxa" w:w="5040"/>
-          </w:tcPr>
-          <w:p>
-            <w:r>
-              <w:t>Assignment Group</w:t>
-            </w:r>
-          </w:p>
-        </w:tc>
-        <w:tc>
-          <w:tcPr>
-            <w:tcW w:type="dxa" w:w="5040"/>
-          </w:tcPr>
-          <w:p>
-            <w:r>
-              <w:t>Hardware</w:t>
-            </w:r>
-          </w:p>
-        </w:tc>
-      </w:tr>
-      <w:tr>
-        <w:tc>
-          <w:tcPr>
-            <w:tcW w:type="dxa" w:w="5040"/>
-          </w:tcPr>
-          <w:p>
-            <w:r>
-              <w:t>Approval</w:t>
-            </w:r>
-          </w:p>
-        </w:tc>
-        <w:tc>
-          <w:tcPr>
-            <w:tcW w:type="dxa" w:w="5040"/>
-          </w:tcPr>
-          <w:p>
-            <w:r>
-              <w:t>Approved</w:t>
-            </w:r>
-          </w:p>
-        </w:tc>
-      </w:tr>
-      <w:tr>
-        <w:tc>
-          <w:tcPr>
-            <w:tcW w:type="dxa" w:w="5040"/>
-          </w:tcPr>
-          <w:p>
-            <w:r>
-              <w:t>Catalog Item Association</w:t>
-            </w:r>
-          </w:p>
-        </w:tc>
-        <w:tc>
-          <w:tcPr>
-            <w:tcW w:type="dxa" w:w="5040"/>
-          </w:tcPr>
-          <w:p>
-            <w:r>
-              <w:t>Standard Laptop → Standard Laptop task</w:t>
-            </w:r>
-          </w:p>
-        </w:tc>
-      </w:tr>
-      <w:tr>
-        <w:tc>
-          <w:tcPr>
-            <w:tcW w:type="dxa" w:w="5040"/>
-          </w:tcPr>
-          <w:p>
-            <w:r>
-              <w:t>Live End-to-End Verification</w:t>
-            </w:r>
-          </w:p>
-        </w:tc>
-        <w:tc>
-          <w:tcPr>
-            <w:tcW w:type="dxa" w:w="5040"/>
-          </w:tcPr>
-          <w:p>
-            <w:r>
-              <w:t>Not evidenced / not performed</w:t>
-            </w:r>
-          </w:p>
-        </w:tc>
-      </w:tr>
-    </w:tbl>
-    <w:p>
-      <w:pPr>
-        <w:pStyle w:val="Heading1"/>
-      </w:pPr>
-      <w:r>
-        <w:t>6. Mentor Review Note</w:t>
-      </w:r>
-    </w:p>
-    <w:p>
-      <w:r>
-        <w:t>The provided screenshots verify the visible Milestone 1 configuration and the Standard Laptop catalog-item flow association. They do not establish that a live test order was approved or that a Catalog Task was automatically generated. Any final claim of end-to-end completion should be supported by a separate live-instance screenshot of the approved RITM and the resulting Catalog Task assigned to Hardware.</w:t>
+        <w:rPr>
+          <w:b/>
+          <w:sz w:val="30"/>
+        </w:rPr>
+        <w:t>Evidence 6 — Generated Catalog Task Record</w:t>
       </w:r>
     </w:p>
     <w:p>
       <w:pPr>
-        <w:pStyle w:val="Heading1"/>
+        <w:jc w:val="center"/>
       </w:pPr>
       <w:r>
-        <w:t>7. Evidence Checklist</w:t>
+        <w:rPr>
+          <w:sz w:val="19"/>
+        </w:rPr>
+        <w:t>Shows real Catalog Task SCTASK0010002 linked to RITM0010001, Approval = Approved, State = Open, and the configured short description and description.</w:t>
       </w:r>
     </w:p>
     <w:p>
       <w:pPr>
-        <w:pStyle w:val="ListBullet"/>
+        <w:jc w:val="center"/>
       </w:pPr>
       <w:r>
-        <w:t>Flow Designer flow named Standard Laptop Task</w:t>
-      </w:r>
-    </w:p>
-    <w:p>
-      <w:pPr>
-        <w:pStyle w:val="ListBullet"/>
-      </w:pPr>
-      <w:r>
-        <w:t>Service Catalog trigger</w:t>
-      </w:r>
-    </w:p>
-    <w:p>
-      <w:pPr>
-        <w:pStyle w:val="ListBullet"/>
-      </w:pPr>
-      <w:r>
-        <w:t>Create Catalog Task action and field mappings</w:t>
-      </w:r>
-    </w:p>
-    <w:p>
-      <w:pPr>
-        <w:pStyle w:val="ListBullet"/>
-      </w:pPr>
-      <w:r>
-        <w:t>Active flow status</w:t>
-      </w:r>
-    </w:p>
-    <w:p>
-      <w:pPr>
-        <w:pStyle w:val="ListBullet"/>
-      </w:pPr>
-      <w:r>
-        <w:t>Standard Laptop Catalog Item association</w:t>
-      </w:r>
-    </w:p>
-    <w:p>
-      <w:pPr>
-        <w:pStyle w:val="ListBullet"/>
-      </w:pPr>
-      <w:r>
-        <w:t>Approved RITM and generated Catalog Task — pending separate live evidence</w:t>
+        <w:drawing>
+          <wp:inline xmlns:a="http://schemas.openxmlformats.org/drawingml/2006/main" xmlns:pic="http://schemas.openxmlformats.org/drawingml/2006/picture">
+            <wp:extent cx="8961120" cy="5603038"/>
+            <wp:docPr id="6" name="Picture 6"/>
+            <wp:cNvGraphicFramePr>
+              <a:graphicFrameLocks noChangeAspect="1"/>
+            </wp:cNvGraphicFramePr>
+            <a:graphic>
+              <a:graphicData uri="http://schemas.openxmlformats.org/drawingml/2006/picture">
+                <pic:pic>
+                  <pic:nvPicPr>
+                    <pic:cNvPr id="0" name="image(20260929-071114).png"/>
+                    <pic:cNvPicPr/>
+                  </pic:nvPicPr>
+                  <pic:blipFill>
+                    <a:blip r:embed="rId14"/>
+                    <a:stretch>
+                      <a:fillRect/>
+                    </a:stretch>
+                  </pic:blipFill>
+                  <pic:spPr>
+                    <a:xfrm>
+                      <a:off x="0" y="0"/>
+                      <a:ext cx="8961120" cy="5603038"/>
+                    </a:xfrm>
+                    <a:prstGeom prst="rect"/>
+                  </pic:spPr>
+                </pic:pic>
+              </a:graphicData>
+            </a:graphic>
+          </wp:inline>
+        </w:drawing>
       </w:r>
     </w:p>
     <w:sectPr>
-      <w:footerReference w:type="default" r:id="rId12"/>
-      <w:pgSz w:w="12240" w:h="15840"/>
-      <w:pgMar w:top="1008" w:right="1080" w:bottom="1008" w:left="1080" w:header="720" w:footer="720" w:gutter="0"/>
+      <w:footerReference w:type="default" r:id="rId15"/>
+      <w:pgSz w:w="15840" w:h="12240" w:orient="landscape"/>
+      <w:pgMar w:top="792" w:right="792" w:bottom="792" w:left="792" w:header="720" w:footer="720" w:gutter="0"/>
       <w:cols w:space="720"/>
       <w:docGrid w:linePitch="360"/>
     </w:sectPr>
@@ -671,7 +706,10 @@
       <w:jc w:val="center"/>
     </w:pPr>
     <w:r>
-      <w:t>Milestone 1 — Standard Laptop Task | Evidence Document</w:t>
+      <w:rPr>
+        <w:sz w:val="16"/>
+      </w:rPr>
+      <w:t>Milestone 1 — ServiceNow evidence</w:t>
     </w:r>
   </w:p>
 </w:ftr>
@@ -1040,10 +1078,6 @@
     <w:name w:val="Normal"/>
     <w:qFormat/>
     <w:rsid w:val="00FC693F"/>
-    <w:rPr>
-      <w:rFonts w:ascii="Aptos" w:hAnsi="Aptos"/>
-      <w:sz w:val="21"/>
-    </w:rPr>
   </w:style>
   <w:style w:type="paragraph" w:styleId="Header">
     <w:name w:val="header"/>
@@ -1104,7 +1138,7 @@
       <w:outlineLvl w:val="0"/>
     </w:pPr>
     <w:rPr>
-      <w:rFonts w:asciiTheme="majorHAnsi" w:eastAsiaTheme="majorEastAsia" w:hAnsiTheme="majorHAnsi" w:cstheme="majorBidi" w:ascii="Aptos" w:hAnsi="Aptos"/>
+      <w:rFonts w:asciiTheme="majorHAnsi" w:eastAsiaTheme="majorEastAsia" w:hAnsiTheme="majorHAnsi" w:cstheme="majorBidi"/>
       <w:b/>
       <w:bCs/>
       <w:color w:val="365F91" w:themeColor="accent1" w:themeShade="BF"/>
@@ -1128,7 +1162,7 @@
       <w:outlineLvl w:val="1"/>
     </w:pPr>
     <w:rPr>
-      <w:rFonts w:asciiTheme="majorHAnsi" w:eastAsiaTheme="majorEastAsia" w:hAnsiTheme="majorHAnsi" w:cstheme="majorBidi" w:ascii="Aptos" w:hAnsi="Aptos"/>
+      <w:rFonts w:asciiTheme="majorHAnsi" w:eastAsiaTheme="majorEastAsia" w:hAnsiTheme="majorHAnsi" w:cstheme="majorBidi"/>
       <w:b/>
       <w:bCs/>
       <w:color w:val="4F81BD" w:themeColor="accent1"/>
@@ -1393,7 +1427,7 @@
       <w:contextualSpacing/>
     </w:pPr>
     <w:rPr>
-      <w:rFonts w:asciiTheme="majorHAnsi" w:eastAsiaTheme="majorEastAsia" w:hAnsiTheme="majorHAnsi" w:cstheme="majorBidi" w:ascii="Aptos" w:hAnsi="Aptos"/>
+      <w:rFonts w:asciiTheme="majorHAnsi" w:eastAsiaTheme="majorEastAsia" w:hAnsiTheme="majorHAnsi" w:cstheme="majorBidi"/>
       <w:color w:val="17365D" w:themeColor="text2" w:themeShade="BF"/>
       <w:spacing w:val="5"/>
       <w:kern w:val="28"/>

</xml_diff>